<commit_message>
refactor: remove legacy manual MCP registration
</commit_message>
<xml_diff>
--- a/Connect_in_Catalog_KajovoMCPCML_v1.4.docx
+++ b/Connect_in_Catalog_KajovoMCPCML_v1.4.docx
@@ -467,7 +467,7 @@
         <w:keepLines w:val="1"/>
       </w:pPr>
       <w:r>
-        <w:t>Tento dokument určuje přesný postup a technické podmínky pro nový MCP server v KajovoMCPCML. Pokrývá handler, vlastní HTTPS identitu, katalog, autorizaci, logging, audit, monitoring, testy a aktivaci. Verze 1.4 přidává preferovaný automatický onboarding: správce vystaví jednorázově zobrazený integrační token, programátor odešle striktní manifest a zdrojový ZIP na register.hcasc.cz a serverový job provede PR, CI, podepsaný OCI deploy, veřejné testy a automatickou aktivaci pouze po úplném PASS.</w:t>
+        <w:t>Tento dokument určuje přesný postup a technické podmínky pro nový MCP server v KajovoMCPCML. Pokrývá handler, vlastní HTTPS identitu, katalog, autorizaci, logging, audit, monitoring, testy a aktivaci. Verze 1.4 stanoví jediný podporovaný registrační tok: správce vystaví jednorázově zobrazený integrační token, programátor odešle striktní manifest a zdrojový ZIP na register.hcasc.cz a serverový job provede PR, CI, podepsaný OCI deploy, veřejné testy a automatickou aktivaci pouze po úplném PASS.</w:t>
       </w:r>
     </w:p>
     <w:p>
@@ -3575,7 +3575,7 @@
         <w:keepLines w:val="1"/>
       </w:pPr>
       <w:r>
-        <w:t>Preferovaně v UI zvolit Automaticky integrovat MCP server a vystavit integrační token; ruční Přidat MCP server zůstává pouze správcovská cesta mimo automatický onboarding.</w:t>
+        <w:t>V UI zvolit Automaticky integrovat MCP server a vystavit integrační token. Ruční registrace ani přímá správcovská aktivace nového serveru nejsou dostupné.</w:t>
       </w:r>
     </w:p>
     <w:p>
@@ -14541,7 +14541,7 @@
         <w:keepLines w:val="1"/>
       </w:pPr>
       <w:r>
-        <w:t>Tato kapitola je závazná pro preferovanou cestu bez ručního vyplňování registrace v UI. Implementační token neobchází bezpečnostní brány: autorizuje jeden serverový onboardingový job, který po úplném PASS sám zaregistruje, otestuje a aktivuje právě jeden nový MCP server.</w:t>
+        <w:t>Tato kapitola je závazná pro jedinou podporovanou registraci bez ručního vyplňování v UI. Implementační token neobchází bezpečnostní brány: autorizuje jeden serverový onboardingový job, který po úplném PASS sám zaregistruje, otestuje a aktivuje právě jeden nový MCP server.</w:t>
       </w:r>
     </w:p>
     <w:tbl>

</xml_diff>